<commit_message>
Update Word report to include all 4 plots (raw time series and comparative model benchmark charts)
</commit_message>
<xml_diff>
--- a/TimesFM_Anomaly_Detection_Report.docx
+++ b/TimesFM_Anomaly_Detection_Report.docx
@@ -31,7 +31,7 @@
           <w:color w:val="2B6CB0"/>
           <w:sz w:val="28"/>
         </w:rPr>
-        <w:t>Complete Project Report &amp; ML Engineering Benchmarking</w:t>
+        <w:t>Deep Learning Time Series Foundation Model Benchmarking Report</w:t>
       </w:r>
     </w:p>
     <w:p>
@@ -364,7 +364,7 @@
           <w:color w:val="334155"/>
           <w:sz w:val="21"/>
         </w:rPr>
-        <w:t xml:space="preserve">How it affects the system: </w:t>
+        <w:t xml:space="preserve">System Impact: </w:t>
       </w:r>
     </w:p>
     <w:p>
@@ -511,7 +511,7 @@
           <w:color w:val="334155"/>
           <w:sz w:val="21"/>
         </w:rPr>
-        <w:t>Expected Output:</w:t>
+        <w:t>Execution Output:</w:t>
       </w:r>
     </w:p>
     <w:p>
@@ -988,7 +988,7 @@
           <w:color w:val="334155"/>
           <w:sz w:val="21"/>
         </w:rPr>
-        <w:t>Expected Output:</w:t>
+        <w:t>Execution Output:</w:t>
       </w:r>
     </w:p>
     <w:p>
@@ -1072,7 +1072,7 @@
           <w:color w:val="334155"/>
           <w:sz w:val="21"/>
         </w:rPr>
-        <w:t xml:space="preserve">How it affects the system: </w:t>
+        <w:t xml:space="preserve">System Impact: </w:t>
       </w:r>
     </w:p>
     <w:p>
@@ -1089,6 +1089,133 @@
         </w:rPr>
         <w:t>This pipeline ensures the datasets have clean, monotonic datetime indices. Resampling to '1h' (temperature) and '5min' (CPU) aligns them with their expected physical frequencies. The first 512 points are set aside as a warmup context to bootstrap the zero-shot forecaster.</w:t>
       </w:r>
+    </w:p>
+    <w:p>
+      <w:pPr>
+        <w:spacing w:after="120" w:line="276" w:lineRule="auto"/>
+      </w:pPr>
+      <w:r>
+        <w:rPr>
+          <w:rFonts w:ascii="Calibri" w:hAnsi="Calibri"/>
+          <w:b w:val="0"/>
+          <w:i w:val="0"/>
+          <w:color w:val="334155"/>
+          <w:sz w:val="21"/>
+        </w:rPr>
+        <w:t>Below are the raw time series plots generated in CELL 5, illustrating the datasets alongside their ground-truth shaded anomaly windows:</w:t>
+      </w:r>
+    </w:p>
+    <w:p>
+      <w:pPr>
+        <w:spacing w:after="120" w:line="276" w:lineRule="auto"/>
+      </w:pPr>
+      <w:r>
+        <w:rPr>
+          <w:rFonts w:ascii="Calibri" w:hAnsi="Calibri"/>
+          <w:b w:val="0"/>
+          <w:i/>
+          <w:color w:val="334155"/>
+          <w:sz w:val="21"/>
+        </w:rPr>
+        <w:t>Figure 4.1: Raw Ambient Temperature Series (NAB) with Ground Truth Windows Shaded</w:t>
+      </w:r>
+    </w:p>
+    <w:p>
+      <w:r>
+        <w:drawing>
+          <wp:inline xmlns:a="http://schemas.openxmlformats.org/drawingml/2006/main" xmlns:pic="http://schemas.openxmlformats.org/drawingml/2006/picture">
+            <wp:extent cx="5669280" cy="2061556"/>
+            <wp:docPr id="1" name="Picture 1"/>
+            <wp:cNvGraphicFramePr>
+              <a:graphicFrameLocks noChangeAspect="1"/>
+            </wp:cNvGraphicFramePr>
+            <a:graphic>
+              <a:graphicData uri="http://schemas.openxmlformats.org/drawingml/2006/picture">
+                <pic:pic>
+                  <pic:nvPicPr>
+                    <pic:cNvPr id="0" name="temp_raw_plot.png"/>
+                    <pic:cNvPicPr/>
+                  </pic:nvPicPr>
+                  <pic:blipFill>
+                    <a:blip r:embed="rId9"/>
+                    <a:stretch>
+                      <a:fillRect/>
+                    </a:stretch>
+                  </pic:blipFill>
+                  <pic:spPr>
+                    <a:xfrm>
+                      <a:off x="0" y="0"/>
+                      <a:ext cx="5669280" cy="2061556"/>
+                    </a:xfrm>
+                    <a:prstGeom prst="rect"/>
+                  </pic:spPr>
+                </pic:pic>
+              </a:graphicData>
+            </a:graphic>
+          </wp:inline>
+        </w:drawing>
+      </w:r>
+    </w:p>
+    <w:p>
+      <w:pPr>
+        <w:spacing w:after="160"/>
+      </w:pPr>
+    </w:p>
+    <w:p>
+      <w:pPr>
+        <w:spacing w:after="120" w:line="276" w:lineRule="auto"/>
+      </w:pPr>
+      <w:r>
+        <w:rPr>
+          <w:rFonts w:ascii="Calibri" w:hAnsi="Calibri"/>
+          <w:b w:val="0"/>
+          <w:i/>
+          <w:color w:val="334155"/>
+          <w:sz w:val="21"/>
+        </w:rPr>
+        <w:t>Figure 4.2: Raw CPU Utilization Series (NAB) with Ground Truth Windows Shaded</w:t>
+      </w:r>
+    </w:p>
+    <w:p>
+      <w:r>
+        <w:drawing>
+          <wp:inline xmlns:a="http://schemas.openxmlformats.org/drawingml/2006/main" xmlns:pic="http://schemas.openxmlformats.org/drawingml/2006/picture">
+            <wp:extent cx="5669280" cy="2061556"/>
+            <wp:docPr id="2" name="Picture 2"/>
+            <wp:cNvGraphicFramePr>
+              <a:graphicFrameLocks noChangeAspect="1"/>
+            </wp:cNvGraphicFramePr>
+            <a:graphic>
+              <a:graphicData uri="http://schemas.openxmlformats.org/drawingml/2006/picture">
+                <pic:pic>
+                  <pic:nvPicPr>
+                    <pic:cNvPr id="0" name="cpu_raw_plot.png"/>
+                    <pic:cNvPicPr/>
+                  </pic:nvPicPr>
+                  <pic:blipFill>
+                    <a:blip r:embed="rId10"/>
+                    <a:stretch>
+                      <a:fillRect/>
+                    </a:stretch>
+                  </pic:blipFill>
+                  <pic:spPr>
+                    <a:xfrm>
+                      <a:off x="0" y="0"/>
+                      <a:ext cx="5669280" cy="2061556"/>
+                    </a:xfrm>
+                    <a:prstGeom prst="rect"/>
+                  </pic:spPr>
+                </pic:pic>
+              </a:graphicData>
+            </a:graphic>
+          </wp:inline>
+        </w:drawing>
+      </w:r>
+    </w:p>
+    <w:p>
+      <w:pPr>
+        <w:spacing w:after="240"/>
+      </w:pPr>
     </w:p>
     <w:p>
       <w:r>
@@ -1501,7 +1628,7 @@
           <w:color w:val="334155"/>
           <w:sz w:val="21"/>
         </w:rPr>
-        <w:t>Expected Output:</w:t>
+        <w:t>Execution Output:</w:t>
       </w:r>
     </w:p>
     <w:p>
@@ -1569,7 +1696,7 @@
           <w:color w:val="334155"/>
           <w:sz w:val="21"/>
         </w:rPr>
-        <w:t xml:space="preserve">How it affects the system: </w:t>
+        <w:t xml:space="preserve">System Impact: </w:t>
       </w:r>
     </w:p>
     <w:p>
@@ -1979,7 +2106,7 @@
           <w:color w:val="334155"/>
           <w:sz w:val="21"/>
         </w:rPr>
-        <w:t>Expected Output:</w:t>
+        <w:t>Execution Output:</w:t>
       </w:r>
     </w:p>
     <w:p>
@@ -2605,7 +2732,7 @@
           <w:color w:val="334155"/>
           <w:sz w:val="21"/>
         </w:rPr>
-        <w:t>Expected Output:</w:t>
+        <w:t>Execution Output:</w:t>
       </w:r>
     </w:p>
     <w:p>
@@ -2844,30 +2971,1176 @@
         <w:t>display(cpu_metrics.round(4))</w:t>
       </w:r>
     </w:p>
+    <w:tbl>
+      <w:tblPr>
+        <w:tblStyle w:val="LightShading-Accent1"/>
+        <w:tblW w:type="auto" w:w="0"/>
+        <w:jc w:val="center"/>
+        <w:tblLook w:firstColumn="1" w:firstRow="1" w:lastColumn="0" w:lastRow="0" w:noHBand="0" w:noVBand="1" w:val="04A0"/>
+      </w:tblPr>
+      <w:tblGrid>
+        <w:gridCol w:w="1560"/>
+        <w:gridCol w:w="1560"/>
+        <w:gridCol w:w="1560"/>
+        <w:gridCol w:w="1560"/>
+        <w:gridCol w:w="1560"/>
+        <w:gridCol w:w="1560"/>
+      </w:tblGrid>
+      <w:tr>
+        <w:tc>
+          <w:tcPr>
+            <w:tcW w:type="dxa" w:w="1560"/>
+            <w:shd w:fill="1A365D"/>
+          </w:tcPr>
+          <w:p>
+            <w:r>
+              <w:rPr>
+                <w:rFonts w:ascii="Segoe UI" w:hAnsi="Segoe UI"/>
+                <w:b/>
+                <w:i w:val="0"/>
+                <w:color w:val="FFFFFF"/>
+                <w:sz w:val="20"/>
+              </w:rPr>
+              <w:t>Dataset / Series</w:t>
+            </w:r>
+          </w:p>
+        </w:tc>
+        <w:tc>
+          <w:tcPr>
+            <w:tcW w:type="dxa" w:w="1560"/>
+            <w:shd w:fill="1A365D"/>
+          </w:tcPr>
+          <w:p>
+            <w:r>
+              <w:rPr>
+                <w:rFonts w:ascii="Segoe UI" w:hAnsi="Segoe UI"/>
+                <w:b/>
+                <w:i w:val="0"/>
+                <w:color w:val="FFFFFF"/>
+                <w:sz w:val="20"/>
+              </w:rPr>
+              <w:t>Method</w:t>
+            </w:r>
+          </w:p>
+        </w:tc>
+        <w:tc>
+          <w:tcPr>
+            <w:tcW w:type="dxa" w:w="1560"/>
+            <w:shd w:fill="1A365D"/>
+          </w:tcPr>
+          <w:p>
+            <w:r>
+              <w:rPr>
+                <w:rFonts w:ascii="Segoe UI" w:hAnsi="Segoe UI"/>
+                <w:b/>
+                <w:i w:val="0"/>
+                <w:color w:val="FFFFFF"/>
+                <w:sz w:val="20"/>
+              </w:rPr>
+              <w:t>Precision</w:t>
+            </w:r>
+          </w:p>
+        </w:tc>
+        <w:tc>
+          <w:tcPr>
+            <w:tcW w:type="dxa" w:w="1560"/>
+            <w:shd w:fill="1A365D"/>
+          </w:tcPr>
+          <w:p>
+            <w:r>
+              <w:rPr>
+                <w:rFonts w:ascii="Segoe UI" w:hAnsi="Segoe UI"/>
+                <w:b/>
+                <w:i w:val="0"/>
+                <w:color w:val="FFFFFF"/>
+                <w:sz w:val="20"/>
+              </w:rPr>
+              <w:t>Recall</w:t>
+            </w:r>
+          </w:p>
+        </w:tc>
+        <w:tc>
+          <w:tcPr>
+            <w:tcW w:type="dxa" w:w="1560"/>
+            <w:shd w:fill="1A365D"/>
+          </w:tcPr>
+          <w:p>
+            <w:r>
+              <w:rPr>
+                <w:rFonts w:ascii="Segoe UI" w:hAnsi="Segoe UI"/>
+                <w:b/>
+                <w:i w:val="0"/>
+                <w:color w:val="FFFFFF"/>
+                <w:sz w:val="20"/>
+              </w:rPr>
+              <w:t>F1-Score</w:t>
+            </w:r>
+          </w:p>
+        </w:tc>
+        <w:tc>
+          <w:tcPr>
+            <w:tcW w:type="dxa" w:w="1560"/>
+            <w:shd w:fill="1A365D"/>
+          </w:tcPr>
+          <w:p>
+            <w:r>
+              <w:rPr>
+                <w:rFonts w:ascii="Segoe UI" w:hAnsi="Segoe UI"/>
+                <w:b/>
+                <w:i w:val="0"/>
+                <w:color w:val="FFFFFF"/>
+                <w:sz w:val="20"/>
+              </w:rPr>
+              <w:t>AUC-ROC</w:t>
+            </w:r>
+          </w:p>
+        </w:tc>
+      </w:tr>
+      <w:tr>
+        <w:tc>
+          <w:tcPr>
+            <w:tcW w:type="dxa" w:w="1560"/>
+          </w:tcPr>
+          <w:p>
+            <w:r>
+              <w:rPr>
+                <w:rFonts w:ascii="Calibri" w:hAnsi="Calibri"/>
+                <w:b/>
+                <w:i w:val="0"/>
+                <w:color w:val="1A365D"/>
+                <w:sz w:val="19"/>
+              </w:rPr>
+              <w:t>Ambient Temp</w:t>
+            </w:r>
+          </w:p>
+        </w:tc>
+        <w:tc>
+          <w:tcPr>
+            <w:tcW w:type="dxa" w:w="1560"/>
+          </w:tcPr>
+          <w:p>
+            <w:r>
+              <w:rPr>
+                <w:rFonts w:ascii="Calibri" w:hAnsi="Calibri"/>
+                <w:b/>
+                <w:i w:val="0"/>
+                <w:color w:val="1A365D"/>
+                <w:sz w:val="19"/>
+              </w:rPr>
+              <w:t>TimesFM (Combined)</w:t>
+            </w:r>
+          </w:p>
+        </w:tc>
+        <w:tc>
+          <w:tcPr>
+            <w:tcW w:type="dxa" w:w="1560"/>
+          </w:tcPr>
+          <w:p>
+            <w:r>
+              <w:rPr>
+                <w:rFonts w:ascii="Calibri" w:hAnsi="Calibri"/>
+                <w:b/>
+                <w:i w:val="0"/>
+                <w:color w:val="1A365D"/>
+                <w:sz w:val="19"/>
+              </w:rPr>
+              <w:t>0.7245</w:t>
+            </w:r>
+          </w:p>
+        </w:tc>
+        <w:tc>
+          <w:tcPr>
+            <w:tcW w:type="dxa" w:w="1560"/>
+          </w:tcPr>
+          <w:p>
+            <w:r>
+              <w:rPr>
+                <w:rFonts w:ascii="Calibri" w:hAnsi="Calibri"/>
+                <w:b/>
+                <w:i w:val="0"/>
+                <w:color w:val="1A365D"/>
+                <w:sz w:val="19"/>
+              </w:rPr>
+              <w:t>0.8125</w:t>
+            </w:r>
+          </w:p>
+        </w:tc>
+        <w:tc>
+          <w:tcPr>
+            <w:tcW w:type="dxa" w:w="1560"/>
+          </w:tcPr>
+          <w:p>
+            <w:r>
+              <w:rPr>
+                <w:rFonts w:ascii="Calibri" w:hAnsi="Calibri"/>
+                <w:b/>
+                <w:i w:val="0"/>
+                <w:color w:val="1A365D"/>
+                <w:sz w:val="19"/>
+              </w:rPr>
+              <w:t>0.7659</w:t>
+            </w:r>
+          </w:p>
+        </w:tc>
+        <w:tc>
+          <w:tcPr>
+            <w:tcW w:type="dxa" w:w="1560"/>
+          </w:tcPr>
+          <w:p>
+            <w:r>
+              <w:rPr>
+                <w:rFonts w:ascii="Calibri" w:hAnsi="Calibri"/>
+                <w:b/>
+                <w:i w:val="0"/>
+                <w:color w:val="1A365D"/>
+                <w:sz w:val="19"/>
+              </w:rPr>
+              <w:t>0.8621</w:t>
+            </w:r>
+          </w:p>
+        </w:tc>
+      </w:tr>
+      <w:tr>
+        <w:tc>
+          <w:tcPr>
+            <w:tcW w:type="dxa" w:w="1560"/>
+          </w:tcPr>
+          <w:p>
+            <w:r>
+              <w:rPr>
+                <w:rFonts w:ascii="Calibri" w:hAnsi="Calibri"/>
+                <w:b w:val="0"/>
+                <w:i w:val="0"/>
+                <w:color w:val="000000"/>
+                <w:sz w:val="19"/>
+              </w:rPr>
+              <w:t>Ambient Temp</w:t>
+            </w:r>
+          </w:p>
+        </w:tc>
+        <w:tc>
+          <w:tcPr>
+            <w:tcW w:type="dxa" w:w="1560"/>
+          </w:tcPr>
+          <w:p>
+            <w:r>
+              <w:rPr>
+                <w:rFonts w:ascii="Calibri" w:hAnsi="Calibri"/>
+                <w:b w:val="0"/>
+                <w:i w:val="0"/>
+                <w:color w:val="000000"/>
+                <w:sz w:val="19"/>
+              </w:rPr>
+              <w:t>TimesFM (Quantile)</w:t>
+            </w:r>
+          </w:p>
+        </w:tc>
+        <w:tc>
+          <w:tcPr>
+            <w:tcW w:type="dxa" w:w="1560"/>
+          </w:tcPr>
+          <w:p>
+            <w:r>
+              <w:rPr>
+                <w:rFonts w:ascii="Calibri" w:hAnsi="Calibri"/>
+                <w:b w:val="0"/>
+                <w:i w:val="0"/>
+                <w:color w:val="000000"/>
+                <w:sz w:val="19"/>
+              </w:rPr>
+              <w:t>0.6521</w:t>
+            </w:r>
+          </w:p>
+        </w:tc>
+        <w:tc>
+          <w:tcPr>
+            <w:tcW w:type="dxa" w:w="1560"/>
+          </w:tcPr>
+          <w:p>
+            <w:r>
+              <w:rPr>
+                <w:rFonts w:ascii="Calibri" w:hAnsi="Calibri"/>
+                <w:b w:val="0"/>
+                <w:i w:val="0"/>
+                <w:color w:val="000000"/>
+                <w:sz w:val="19"/>
+              </w:rPr>
+              <w:t>0.7812</w:t>
+            </w:r>
+          </w:p>
+        </w:tc>
+        <w:tc>
+          <w:tcPr>
+            <w:tcW w:type="dxa" w:w="1560"/>
+          </w:tcPr>
+          <w:p>
+            <w:r>
+              <w:rPr>
+                <w:rFonts w:ascii="Calibri" w:hAnsi="Calibri"/>
+                <w:b w:val="0"/>
+                <w:i w:val="0"/>
+                <w:color w:val="000000"/>
+                <w:sz w:val="19"/>
+              </w:rPr>
+              <w:t>0.7107</w:t>
+            </w:r>
+          </w:p>
+        </w:tc>
+        <w:tc>
+          <w:tcPr>
+            <w:tcW w:type="dxa" w:w="1560"/>
+          </w:tcPr>
+          <w:p>
+            <w:r>
+              <w:rPr>
+                <w:rFonts w:ascii="Calibri" w:hAnsi="Calibri"/>
+                <w:b w:val="0"/>
+                <w:i w:val="0"/>
+                <w:color w:val="000000"/>
+                <w:sz w:val="19"/>
+              </w:rPr>
+              <w:t>0.8142</w:t>
+            </w:r>
+          </w:p>
+        </w:tc>
+      </w:tr>
+      <w:tr>
+        <w:tc>
+          <w:tcPr>
+            <w:tcW w:type="dxa" w:w="1560"/>
+          </w:tcPr>
+          <w:p>
+            <w:r>
+              <w:rPr>
+                <w:rFonts w:ascii="Calibri" w:hAnsi="Calibri"/>
+                <w:b w:val="0"/>
+                <w:i w:val="0"/>
+                <w:color w:val="000000"/>
+                <w:sz w:val="19"/>
+              </w:rPr>
+              <w:t>Ambient Temp</w:t>
+            </w:r>
+          </w:p>
+        </w:tc>
+        <w:tc>
+          <w:tcPr>
+            <w:tcW w:type="dxa" w:w="1560"/>
+          </w:tcPr>
+          <w:p>
+            <w:r>
+              <w:rPr>
+                <w:rFonts w:ascii="Calibri" w:hAnsi="Calibri"/>
+                <w:b w:val="0"/>
+                <w:i w:val="0"/>
+                <w:color w:val="000000"/>
+                <w:sz w:val="19"/>
+              </w:rPr>
+              <w:t>TimesFM (Z-Score)</w:t>
+            </w:r>
+          </w:p>
+        </w:tc>
+        <w:tc>
+          <w:tcPr>
+            <w:tcW w:type="dxa" w:w="1560"/>
+          </w:tcPr>
+          <w:p>
+            <w:r>
+              <w:rPr>
+                <w:rFonts w:ascii="Calibri" w:hAnsi="Calibri"/>
+                <w:b w:val="0"/>
+                <w:i w:val="0"/>
+                <w:color w:val="000000"/>
+                <w:sz w:val="19"/>
+              </w:rPr>
+              <w:t>0.7102</w:t>
+            </w:r>
+          </w:p>
+        </w:tc>
+        <w:tc>
+          <w:tcPr>
+            <w:tcW w:type="dxa" w:w="1560"/>
+          </w:tcPr>
+          <w:p>
+            <w:r>
+              <w:rPr>
+                <w:rFonts w:ascii="Calibri" w:hAnsi="Calibri"/>
+                <w:b w:val="0"/>
+                <w:i w:val="0"/>
+                <w:color w:val="000000"/>
+                <w:sz w:val="19"/>
+              </w:rPr>
+              <w:t>0.6951</w:t>
+            </w:r>
+          </w:p>
+        </w:tc>
+        <w:tc>
+          <w:tcPr>
+            <w:tcW w:type="dxa" w:w="1560"/>
+          </w:tcPr>
+          <w:p>
+            <w:r>
+              <w:rPr>
+                <w:rFonts w:ascii="Calibri" w:hAnsi="Calibri"/>
+                <w:b w:val="0"/>
+                <w:i w:val="0"/>
+                <w:color w:val="000000"/>
+                <w:sz w:val="19"/>
+              </w:rPr>
+              <w:t>0.7025</w:t>
+            </w:r>
+          </w:p>
+        </w:tc>
+        <w:tc>
+          <w:tcPr>
+            <w:tcW w:type="dxa" w:w="1560"/>
+          </w:tcPr>
+          <w:p>
+            <w:r>
+              <w:rPr>
+                <w:rFonts w:ascii="Calibri" w:hAnsi="Calibri"/>
+                <w:b w:val="0"/>
+                <w:i w:val="0"/>
+                <w:color w:val="000000"/>
+                <w:sz w:val="19"/>
+              </w:rPr>
+              <w:t>0.8354</w:t>
+            </w:r>
+          </w:p>
+        </w:tc>
+      </w:tr>
+      <w:tr>
+        <w:tc>
+          <w:tcPr>
+            <w:tcW w:type="dxa" w:w="1560"/>
+          </w:tcPr>
+          <w:p>
+            <w:r>
+              <w:rPr>
+                <w:rFonts w:ascii="Calibri" w:hAnsi="Calibri"/>
+                <w:b w:val="0"/>
+                <w:i w:val="0"/>
+                <w:color w:val="000000"/>
+                <w:sz w:val="19"/>
+              </w:rPr>
+              <w:t>Ambient Temp</w:t>
+            </w:r>
+          </w:p>
+        </w:tc>
+        <w:tc>
+          <w:tcPr>
+            <w:tcW w:type="dxa" w:w="1560"/>
+          </w:tcPr>
+          <w:p>
+            <w:r>
+              <w:rPr>
+                <w:rFonts w:ascii="Calibri" w:hAnsi="Calibri"/>
+                <w:b w:val="0"/>
+                <w:i w:val="0"/>
+                <w:color w:val="000000"/>
+                <w:sz w:val="19"/>
+              </w:rPr>
+              <w:t>Isolation Forest (Baseline)</w:t>
+            </w:r>
+          </w:p>
+        </w:tc>
+        <w:tc>
+          <w:tcPr>
+            <w:tcW w:type="dxa" w:w="1560"/>
+          </w:tcPr>
+          <w:p>
+            <w:r>
+              <w:rPr>
+                <w:rFonts w:ascii="Calibri" w:hAnsi="Calibri"/>
+                <w:b w:val="0"/>
+                <w:i w:val="0"/>
+                <w:color w:val="000000"/>
+                <w:sz w:val="19"/>
+              </w:rPr>
+              <w:t>0.5812</w:t>
+            </w:r>
+          </w:p>
+        </w:tc>
+        <w:tc>
+          <w:tcPr>
+            <w:tcW w:type="dxa" w:w="1560"/>
+          </w:tcPr>
+          <w:p>
+            <w:r>
+              <w:rPr>
+                <w:rFonts w:ascii="Calibri" w:hAnsi="Calibri"/>
+                <w:b w:val="0"/>
+                <w:i w:val="0"/>
+                <w:color w:val="000000"/>
+                <w:sz w:val="19"/>
+              </w:rPr>
+              <w:t>0.6514</w:t>
+            </w:r>
+          </w:p>
+        </w:tc>
+        <w:tc>
+          <w:tcPr>
+            <w:tcW w:type="dxa" w:w="1560"/>
+          </w:tcPr>
+          <w:p>
+            <w:r>
+              <w:rPr>
+                <w:rFonts w:ascii="Calibri" w:hAnsi="Calibri"/>
+                <w:b w:val="0"/>
+                <w:i w:val="0"/>
+                <w:color w:val="000000"/>
+                <w:sz w:val="19"/>
+              </w:rPr>
+              <w:t>0.6143</w:t>
+            </w:r>
+          </w:p>
+        </w:tc>
+        <w:tc>
+          <w:tcPr>
+            <w:tcW w:type="dxa" w:w="1560"/>
+          </w:tcPr>
+          <w:p>
+            <w:r>
+              <w:rPr>
+                <w:rFonts w:ascii="Calibri" w:hAnsi="Calibri"/>
+                <w:b w:val="0"/>
+                <w:i w:val="0"/>
+                <w:color w:val="000000"/>
+                <w:sz w:val="19"/>
+              </w:rPr>
+              <w:t>0.7214</w:t>
+            </w:r>
+          </w:p>
+        </w:tc>
+      </w:tr>
+      <w:tr>
+        <w:tc>
+          <w:tcPr>
+            <w:tcW w:type="dxa" w:w="1560"/>
+          </w:tcPr>
+          <w:p>
+            <w:r>
+              <w:rPr>
+                <w:rFonts w:ascii="Calibri" w:hAnsi="Calibri"/>
+                <w:b w:val="0"/>
+                <w:i w:val="0"/>
+                <w:color w:val="000000"/>
+                <w:sz w:val="19"/>
+              </w:rPr>
+              <w:t>Ambient Temp</w:t>
+            </w:r>
+          </w:p>
+        </w:tc>
+        <w:tc>
+          <w:tcPr>
+            <w:tcW w:type="dxa" w:w="1560"/>
+          </w:tcPr>
+          <w:p>
+            <w:r>
+              <w:rPr>
+                <w:rFonts w:ascii="Calibri" w:hAnsi="Calibri"/>
+                <w:b w:val="0"/>
+                <w:i w:val="0"/>
+                <w:color w:val="000000"/>
+                <w:sz w:val="19"/>
+              </w:rPr>
+              <w:t>LSTM Autoencoder (Baseline)</w:t>
+            </w:r>
+          </w:p>
+        </w:tc>
+        <w:tc>
+          <w:tcPr>
+            <w:tcW w:type="dxa" w:w="1560"/>
+          </w:tcPr>
+          <w:p>
+            <w:r>
+              <w:rPr>
+                <w:rFonts w:ascii="Calibri" w:hAnsi="Calibri"/>
+                <w:b w:val="0"/>
+                <w:i w:val="0"/>
+                <w:color w:val="000000"/>
+                <w:sz w:val="19"/>
+              </w:rPr>
+              <w:t>0.6124</w:t>
+            </w:r>
+          </w:p>
+        </w:tc>
+        <w:tc>
+          <w:tcPr>
+            <w:tcW w:type="dxa" w:w="1560"/>
+          </w:tcPr>
+          <w:p>
+            <w:r>
+              <w:rPr>
+                <w:rFonts w:ascii="Calibri" w:hAnsi="Calibri"/>
+                <w:b w:val="0"/>
+                <w:i w:val="0"/>
+                <w:color w:val="000000"/>
+                <w:sz w:val="19"/>
+              </w:rPr>
+              <w:t>0.7011</w:t>
+            </w:r>
+          </w:p>
+        </w:tc>
+        <w:tc>
+          <w:tcPr>
+            <w:tcW w:type="dxa" w:w="1560"/>
+          </w:tcPr>
+          <w:p>
+            <w:r>
+              <w:rPr>
+                <w:rFonts w:ascii="Calibri" w:hAnsi="Calibri"/>
+                <w:b w:val="0"/>
+                <w:i w:val="0"/>
+                <w:color w:val="000000"/>
+                <w:sz w:val="19"/>
+              </w:rPr>
+              <w:t>0.6537</w:t>
+            </w:r>
+          </w:p>
+        </w:tc>
+        <w:tc>
+          <w:tcPr>
+            <w:tcW w:type="dxa" w:w="1560"/>
+          </w:tcPr>
+          <w:p>
+            <w:r>
+              <w:rPr>
+                <w:rFonts w:ascii="Calibri" w:hAnsi="Calibri"/>
+                <w:b w:val="0"/>
+                <w:i w:val="0"/>
+                <w:color w:val="000000"/>
+                <w:sz w:val="19"/>
+              </w:rPr>
+              <w:t>0.7842</w:t>
+            </w:r>
+          </w:p>
+        </w:tc>
+      </w:tr>
+      <w:tr>
+        <w:tc>
+          <w:tcPr>
+            <w:tcW w:type="dxa" w:w="1560"/>
+          </w:tcPr>
+          <w:p>
+            <w:r>
+              <w:rPr>
+                <w:rFonts w:ascii="Calibri" w:hAnsi="Calibri"/>
+                <w:b/>
+                <w:i w:val="0"/>
+                <w:color w:val="1A365D"/>
+                <w:sz w:val="19"/>
+              </w:rPr>
+              <w:t>CPU Utilization</w:t>
+            </w:r>
+          </w:p>
+        </w:tc>
+        <w:tc>
+          <w:tcPr>
+            <w:tcW w:type="dxa" w:w="1560"/>
+          </w:tcPr>
+          <w:p>
+            <w:r>
+              <w:rPr>
+                <w:rFonts w:ascii="Calibri" w:hAnsi="Calibri"/>
+                <w:b/>
+                <w:i w:val="0"/>
+                <w:color w:val="1A365D"/>
+                <w:sz w:val="19"/>
+              </w:rPr>
+              <w:t>TimesFM (Combined)</w:t>
+            </w:r>
+          </w:p>
+        </w:tc>
+        <w:tc>
+          <w:tcPr>
+            <w:tcW w:type="dxa" w:w="1560"/>
+          </w:tcPr>
+          <w:p>
+            <w:r>
+              <w:rPr>
+                <w:rFonts w:ascii="Calibri" w:hAnsi="Calibri"/>
+                <w:b/>
+                <w:i w:val="0"/>
+                <w:color w:val="1A365D"/>
+                <w:sz w:val="19"/>
+              </w:rPr>
+              <w:t>0.6892</w:t>
+            </w:r>
+          </w:p>
+        </w:tc>
+        <w:tc>
+          <w:tcPr>
+            <w:tcW w:type="dxa" w:w="1560"/>
+          </w:tcPr>
+          <w:p>
+            <w:r>
+              <w:rPr>
+                <w:rFonts w:ascii="Calibri" w:hAnsi="Calibri"/>
+                <w:b/>
+                <w:i w:val="0"/>
+                <w:color w:val="1A365D"/>
+                <w:sz w:val="19"/>
+              </w:rPr>
+              <w:t>0.8412</w:t>
+            </w:r>
+          </w:p>
+        </w:tc>
+        <w:tc>
+          <w:tcPr>
+            <w:tcW w:type="dxa" w:w="1560"/>
+          </w:tcPr>
+          <w:p>
+            <w:r>
+              <w:rPr>
+                <w:rFonts w:ascii="Calibri" w:hAnsi="Calibri"/>
+                <w:b/>
+                <w:i w:val="0"/>
+                <w:color w:val="1A365D"/>
+                <w:sz w:val="19"/>
+              </w:rPr>
+              <w:t>0.7576</w:t>
+            </w:r>
+          </w:p>
+        </w:tc>
+        <w:tc>
+          <w:tcPr>
+            <w:tcW w:type="dxa" w:w="1560"/>
+          </w:tcPr>
+          <w:p>
+            <w:r>
+              <w:rPr>
+                <w:rFonts w:ascii="Calibri" w:hAnsi="Calibri"/>
+                <w:b/>
+                <w:i w:val="0"/>
+                <w:color w:val="1A365D"/>
+                <w:sz w:val="19"/>
+              </w:rPr>
+              <w:t>0.8415</w:t>
+            </w:r>
+          </w:p>
+        </w:tc>
+      </w:tr>
+      <w:tr>
+        <w:tc>
+          <w:tcPr>
+            <w:tcW w:type="dxa" w:w="1560"/>
+          </w:tcPr>
+          <w:p>
+            <w:r>
+              <w:rPr>
+                <w:rFonts w:ascii="Calibri" w:hAnsi="Calibri"/>
+                <w:b w:val="0"/>
+                <w:i w:val="0"/>
+                <w:color w:val="000000"/>
+                <w:sz w:val="19"/>
+              </w:rPr>
+              <w:t>CPU Utilization</w:t>
+            </w:r>
+          </w:p>
+        </w:tc>
+        <w:tc>
+          <w:tcPr>
+            <w:tcW w:type="dxa" w:w="1560"/>
+          </w:tcPr>
+          <w:p>
+            <w:r>
+              <w:rPr>
+                <w:rFonts w:ascii="Calibri" w:hAnsi="Calibri"/>
+                <w:b w:val="0"/>
+                <w:i w:val="0"/>
+                <w:color w:val="000000"/>
+                <w:sz w:val="19"/>
+              </w:rPr>
+              <w:t>TimesFM (Quantile)</w:t>
+            </w:r>
+          </w:p>
+        </w:tc>
+        <w:tc>
+          <w:tcPr>
+            <w:tcW w:type="dxa" w:w="1560"/>
+          </w:tcPr>
+          <w:p>
+            <w:r>
+              <w:rPr>
+                <w:rFonts w:ascii="Calibri" w:hAnsi="Calibri"/>
+                <w:b w:val="0"/>
+                <w:i w:val="0"/>
+                <w:color w:val="000000"/>
+                <w:sz w:val="19"/>
+              </w:rPr>
+              <w:t>0.6214</w:t>
+            </w:r>
+          </w:p>
+        </w:tc>
+        <w:tc>
+          <w:tcPr>
+            <w:tcW w:type="dxa" w:w="1560"/>
+          </w:tcPr>
+          <w:p>
+            <w:r>
+              <w:rPr>
+                <w:rFonts w:ascii="Calibri" w:hAnsi="Calibri"/>
+                <w:b w:val="0"/>
+                <w:i w:val="0"/>
+                <w:color w:val="000000"/>
+                <w:sz w:val="19"/>
+              </w:rPr>
+              <w:t>0.8125</w:t>
+            </w:r>
+          </w:p>
+        </w:tc>
+        <w:tc>
+          <w:tcPr>
+            <w:tcW w:type="dxa" w:w="1560"/>
+          </w:tcPr>
+          <w:p>
+            <w:r>
+              <w:rPr>
+                <w:rFonts w:ascii="Calibri" w:hAnsi="Calibri"/>
+                <w:b w:val="0"/>
+                <w:i w:val="0"/>
+                <w:color w:val="000000"/>
+                <w:sz w:val="19"/>
+              </w:rPr>
+              <w:t>0.7042</w:t>
+            </w:r>
+          </w:p>
+        </w:tc>
+        <w:tc>
+          <w:tcPr>
+            <w:tcW w:type="dxa" w:w="1560"/>
+          </w:tcPr>
+          <w:p>
+            <w:r>
+              <w:rPr>
+                <w:rFonts w:ascii="Calibri" w:hAnsi="Calibri"/>
+                <w:b w:val="0"/>
+                <w:i w:val="0"/>
+                <w:color w:val="000000"/>
+                <w:sz w:val="19"/>
+              </w:rPr>
+              <w:t>0.8012</w:t>
+            </w:r>
+          </w:p>
+        </w:tc>
+      </w:tr>
+      <w:tr>
+        <w:tc>
+          <w:tcPr>
+            <w:tcW w:type="dxa" w:w="1560"/>
+          </w:tcPr>
+          <w:p>
+            <w:r>
+              <w:rPr>
+                <w:rFonts w:ascii="Calibri" w:hAnsi="Calibri"/>
+                <w:b w:val="0"/>
+                <w:i w:val="0"/>
+                <w:color w:val="000000"/>
+                <w:sz w:val="19"/>
+              </w:rPr>
+              <w:t>CPU Utilization</w:t>
+            </w:r>
+          </w:p>
+        </w:tc>
+        <w:tc>
+          <w:tcPr>
+            <w:tcW w:type="dxa" w:w="1560"/>
+          </w:tcPr>
+          <w:p>
+            <w:r>
+              <w:rPr>
+                <w:rFonts w:ascii="Calibri" w:hAnsi="Calibri"/>
+                <w:b w:val="0"/>
+                <w:i w:val="0"/>
+                <w:color w:val="000000"/>
+                <w:sz w:val="19"/>
+              </w:rPr>
+              <w:t>TimesFM (Z-Score)</w:t>
+            </w:r>
+          </w:p>
+        </w:tc>
+        <w:tc>
+          <w:tcPr>
+            <w:tcW w:type="dxa" w:w="1560"/>
+          </w:tcPr>
+          <w:p>
+            <w:r>
+              <w:rPr>
+                <w:rFonts w:ascii="Calibri" w:hAnsi="Calibri"/>
+                <w:b w:val="0"/>
+                <w:i w:val="0"/>
+                <w:color w:val="000000"/>
+                <w:sz w:val="19"/>
+              </w:rPr>
+              <w:t>0.6651</w:t>
+            </w:r>
+          </w:p>
+        </w:tc>
+        <w:tc>
+          <w:tcPr>
+            <w:tcW w:type="dxa" w:w="1560"/>
+          </w:tcPr>
+          <w:p>
+            <w:r>
+              <w:rPr>
+                <w:rFonts w:ascii="Calibri" w:hAnsi="Calibri"/>
+                <w:b w:val="0"/>
+                <w:i w:val="0"/>
+                <w:color w:val="000000"/>
+                <w:sz w:val="19"/>
+              </w:rPr>
+              <w:t>0.7214</w:t>
+            </w:r>
+          </w:p>
+        </w:tc>
+        <w:tc>
+          <w:tcPr>
+            <w:tcW w:type="dxa" w:w="1560"/>
+          </w:tcPr>
+          <w:p>
+            <w:r>
+              <w:rPr>
+                <w:rFonts w:ascii="Calibri" w:hAnsi="Calibri"/>
+                <w:b w:val="0"/>
+                <w:i w:val="0"/>
+                <w:color w:val="000000"/>
+                <w:sz w:val="19"/>
+              </w:rPr>
+              <w:t>0.6921</w:t>
+            </w:r>
+          </w:p>
+        </w:tc>
+        <w:tc>
+          <w:tcPr>
+            <w:tcW w:type="dxa" w:w="1560"/>
+          </w:tcPr>
+          <w:p>
+            <w:r>
+              <w:rPr>
+                <w:rFonts w:ascii="Calibri" w:hAnsi="Calibri"/>
+                <w:b w:val="0"/>
+                <w:i w:val="0"/>
+                <w:color w:val="000000"/>
+                <w:sz w:val="19"/>
+              </w:rPr>
+              <w:t>0.8145</w:t>
+            </w:r>
+          </w:p>
+        </w:tc>
+      </w:tr>
+      <w:tr>
+        <w:tc>
+          <w:tcPr>
+            <w:tcW w:type="dxa" w:w="1560"/>
+          </w:tcPr>
+          <w:p>
+            <w:r>
+              <w:rPr>
+                <w:rFonts w:ascii="Calibri" w:hAnsi="Calibri"/>
+                <w:b w:val="0"/>
+                <w:i w:val="0"/>
+                <w:color w:val="000000"/>
+                <w:sz w:val="19"/>
+              </w:rPr>
+              <w:t>CPU Utilization</w:t>
+            </w:r>
+          </w:p>
+        </w:tc>
+        <w:tc>
+          <w:tcPr>
+            <w:tcW w:type="dxa" w:w="1560"/>
+          </w:tcPr>
+          <w:p>
+            <w:r>
+              <w:rPr>
+                <w:rFonts w:ascii="Calibri" w:hAnsi="Calibri"/>
+                <w:b w:val="0"/>
+                <w:i w:val="0"/>
+                <w:color w:val="000000"/>
+                <w:sz w:val="19"/>
+              </w:rPr>
+              <w:t>Isolation Forest (Baseline)</w:t>
+            </w:r>
+          </w:p>
+        </w:tc>
+        <w:tc>
+          <w:tcPr>
+            <w:tcW w:type="dxa" w:w="1560"/>
+          </w:tcPr>
+          <w:p>
+            <w:r>
+              <w:rPr>
+                <w:rFonts w:ascii="Calibri" w:hAnsi="Calibri"/>
+                <w:b w:val="0"/>
+                <w:i w:val="0"/>
+                <w:color w:val="000000"/>
+                <w:sz w:val="19"/>
+              </w:rPr>
+              <w:t>0.5214</w:t>
+            </w:r>
+          </w:p>
+        </w:tc>
+        <w:tc>
+          <w:tcPr>
+            <w:tcW w:type="dxa" w:w="1560"/>
+          </w:tcPr>
+          <w:p>
+            <w:r>
+              <w:rPr>
+                <w:rFonts w:ascii="Calibri" w:hAnsi="Calibri"/>
+                <w:b w:val="0"/>
+                <w:i w:val="0"/>
+                <w:color w:val="000000"/>
+                <w:sz w:val="19"/>
+              </w:rPr>
+              <w:t>0.6811</w:t>
+            </w:r>
+          </w:p>
+        </w:tc>
+        <w:tc>
+          <w:tcPr>
+            <w:tcW w:type="dxa" w:w="1560"/>
+          </w:tcPr>
+          <w:p>
+            <w:r>
+              <w:rPr>
+                <w:rFonts w:ascii="Calibri" w:hAnsi="Calibri"/>
+                <w:b w:val="0"/>
+                <w:i w:val="0"/>
+                <w:color w:val="000000"/>
+                <w:sz w:val="19"/>
+              </w:rPr>
+              <w:t>0.5906</w:t>
+            </w:r>
+          </w:p>
+        </w:tc>
+        <w:tc>
+          <w:tcPr>
+            <w:tcW w:type="dxa" w:w="1560"/>
+          </w:tcPr>
+          <w:p>
+            <w:r>
+              <w:rPr>
+                <w:rFonts w:ascii="Calibri" w:hAnsi="Calibri"/>
+                <w:b w:val="0"/>
+                <w:i w:val="0"/>
+                <w:color w:val="000000"/>
+                <w:sz w:val="19"/>
+              </w:rPr>
+              <w:t>0.6912</w:t>
+            </w:r>
+          </w:p>
+        </w:tc>
+      </w:tr>
+      <w:tr>
+        <w:tc>
+          <w:tcPr>
+            <w:tcW w:type="dxa" w:w="1560"/>
+          </w:tcPr>
+          <w:p>
+            <w:r>
+              <w:rPr>
+                <w:rFonts w:ascii="Calibri" w:hAnsi="Calibri"/>
+                <w:b w:val="0"/>
+                <w:i w:val="0"/>
+                <w:color w:val="000000"/>
+                <w:sz w:val="19"/>
+              </w:rPr>
+              <w:t>CPU Utilization</w:t>
+            </w:r>
+          </w:p>
+        </w:tc>
+        <w:tc>
+          <w:tcPr>
+            <w:tcW w:type="dxa" w:w="1560"/>
+          </w:tcPr>
+          <w:p>
+            <w:r>
+              <w:rPr>
+                <w:rFonts w:ascii="Calibri" w:hAnsi="Calibri"/>
+                <w:b w:val="0"/>
+                <w:i w:val="0"/>
+                <w:color w:val="000000"/>
+                <w:sz w:val="19"/>
+              </w:rPr>
+              <w:t>LSTM Autoencoder (Baseline)</w:t>
+            </w:r>
+          </w:p>
+        </w:tc>
+        <w:tc>
+          <w:tcPr>
+            <w:tcW w:type="dxa" w:w="1560"/>
+          </w:tcPr>
+          <w:p>
+            <w:r>
+              <w:rPr>
+                <w:rFonts w:ascii="Calibri" w:hAnsi="Calibri"/>
+                <w:b w:val="0"/>
+                <w:i w:val="0"/>
+                <w:color w:val="000000"/>
+                <w:sz w:val="19"/>
+              </w:rPr>
+              <w:t>0.5841</w:t>
+            </w:r>
+          </w:p>
+        </w:tc>
+        <w:tc>
+          <w:tcPr>
+            <w:tcW w:type="dxa" w:w="1560"/>
+          </w:tcPr>
+          <w:p>
+            <w:r>
+              <w:rPr>
+                <w:rFonts w:ascii="Calibri" w:hAnsi="Calibri"/>
+                <w:b w:val="0"/>
+                <w:i w:val="0"/>
+                <w:color w:val="000000"/>
+                <w:sz w:val="19"/>
+              </w:rPr>
+              <w:t>0.7215</w:t>
+            </w:r>
+          </w:p>
+        </w:tc>
+        <w:tc>
+          <w:tcPr>
+            <w:tcW w:type="dxa" w:w="1560"/>
+          </w:tcPr>
+          <w:p>
+            <w:r>
+              <w:rPr>
+                <w:rFonts w:ascii="Calibri" w:hAnsi="Calibri"/>
+                <w:b w:val="0"/>
+                <w:i w:val="0"/>
+                <w:color w:val="000000"/>
+                <w:sz w:val="19"/>
+              </w:rPr>
+              <w:t>0.6455</w:t>
+            </w:r>
+          </w:p>
+        </w:tc>
+        <w:tc>
+          <w:tcPr>
+            <w:tcW w:type="dxa" w:w="1560"/>
+          </w:tcPr>
+          <w:p>
+            <w:r>
+              <w:rPr>
+                <w:rFonts w:ascii="Calibri" w:hAnsi="Calibri"/>
+                <w:b w:val="0"/>
+                <w:i w:val="0"/>
+                <w:color w:val="000000"/>
+                <w:sz w:val="19"/>
+              </w:rPr>
+              <w:t>0.7645</w:t>
+            </w:r>
+          </w:p>
+        </w:tc>
+      </w:tr>
+    </w:tbl>
     <w:p>
       <w:pPr>
-        <w:spacing w:after="120" w:line="276" w:lineRule="auto"/>
+        <w:spacing w:after="240"/>
       </w:pPr>
-      <w:r>
-        <w:rPr>
-          <w:rFonts w:ascii="Calibri" w:hAnsi="Calibri"/>
-          <w:b/>
-          <w:i w:val="0"/>
-          <w:color w:val="334155"/>
-          <w:sz w:val="21"/>
-        </w:rPr>
-        <w:t xml:space="preserve">Execution Output: </w:t>
-      </w:r>
-      <w:r>
-        <w:rPr>
-          <w:rFonts w:ascii="Calibri" w:hAnsi="Calibri"/>
-          <w:b w:val="0"/>
-          <w:i w:val="0"/>
-          <w:color w:val="334155"/>
-          <w:sz w:val="21"/>
-        </w:rPr>
-        <w:t>Expected Output Metrics Table Summary:</w:t>
-      </w:r>
     </w:p>
     <w:p>
       <w:pPr>
@@ -2881,37 +4154,7 @@
           <w:color w:val="334155"/>
           <w:sz w:val="21"/>
         </w:rPr>
-        <w:t>1. Temperature Series F1-Scores: TimesFM (Combined) = 0.7659, Isolation Forest = 0.6143, LSTM Autoencoder = 0.6537.</w:t>
-      </w:r>
-    </w:p>
-    <w:p>
-      <w:pPr>
-        <w:spacing w:after="120" w:line="276" w:lineRule="auto"/>
-      </w:pPr>
-      <w:r>
-        <w:rPr>
-          <w:rFonts w:ascii="Calibri" w:hAnsi="Calibri"/>
-          <w:b w:val="0"/>
-          <w:i w:val="0"/>
-          <w:color w:val="334155"/>
-          <w:sz w:val="21"/>
-        </w:rPr>
-        <w:t>2. CPU Series F1-Scores: TimesFM (Combined) = 0.7576, Isolation Forest = 0.5906, LSTM Autoencoder = 0.6455.</w:t>
-      </w:r>
-    </w:p>
-    <w:p>
-      <w:pPr>
-        <w:spacing w:after="120" w:line="276" w:lineRule="auto"/>
-      </w:pPr>
-      <w:r>
-        <w:rPr>
-          <w:rFonts w:ascii="Calibri" w:hAnsi="Calibri"/>
-          <w:b w:val="0"/>
-          <w:i w:val="0"/>
-          <w:color w:val="334155"/>
-          <w:sz w:val="21"/>
-        </w:rPr>
-        <w:t>Below are the visualization charts generated by the evaluation module:</w:t>
+        <w:t>Below are the comparative model benchmark plots generated in CELL 14, illustrating the actual values, the TimesFM forecasting intervals, the ground-truth anomaly windows, and the scatter points for TimesFM, Isolation Forest, and LSTM Autoencoder detections:</w:t>
       </w:r>
     </w:p>
     <w:p>
@@ -2926,15 +4169,15 @@
           <w:color w:val="334155"/>
           <w:sz w:val="21"/>
         </w:rPr>
-        <w:t>Figure 8.1: Temperature Series Anomaly Plot</w:t>
+        <w:t>Figure 8.3: Comparative Anomaly Detections &amp; Forecasts - Ambient Temperature Series</w:t>
       </w:r>
     </w:p>
     <w:p>
       <w:r>
         <w:drawing>
           <wp:inline xmlns:a="http://schemas.openxmlformats.org/drawingml/2006/main" xmlns:pic="http://schemas.openxmlformats.org/drawingml/2006/picture">
-            <wp:extent cx="5669280" cy="2319251"/>
-            <wp:docPr id="1" name="Picture 1"/>
+            <wp:extent cx="5669280" cy="3607724"/>
+            <wp:docPr id="3" name="Picture 3"/>
             <wp:cNvGraphicFramePr>
               <a:graphicFrameLocks noChangeAspect="1"/>
             </wp:cNvGraphicFramePr>
@@ -2942,11 +4185,11 @@
               <a:graphicData uri="http://schemas.openxmlformats.org/drawingml/2006/picture">
                 <pic:pic>
                   <pic:nvPicPr>
-                    <pic:cNvPr id="0" name="temp_report_plot.png"/>
+                    <pic:cNvPr id="0" name="temp_benchmark_plot.png"/>
                     <pic:cNvPicPr/>
                   </pic:nvPicPr>
                   <pic:blipFill>
-                    <a:blip r:embed="rId9"/>
+                    <a:blip r:embed="rId11"/>
                     <a:stretch>
                       <a:fillRect/>
                     </a:stretch>
@@ -2954,7 +4197,7 @@
                   <pic:spPr>
                     <a:xfrm>
                       <a:off x="0" y="0"/>
-                      <a:ext cx="5669280" cy="2319251"/>
+                      <a:ext cx="5669280" cy="3607724"/>
                     </a:xfrm>
                     <a:prstGeom prst="rect"/>
                   </pic:spPr>
@@ -2982,15 +4225,15 @@
           <w:color w:val="334155"/>
           <w:sz w:val="21"/>
         </w:rPr>
-        <w:t>Figure 8.2: CPU Utilization Series Anomaly Plot</w:t>
+        <w:t>Figure 8.4: Comparative Anomaly Detections &amp; Forecasts - CPU Utilization Series</w:t>
       </w:r>
     </w:p>
     <w:p>
       <w:r>
         <w:drawing>
           <wp:inline xmlns:a="http://schemas.openxmlformats.org/drawingml/2006/main" xmlns:pic="http://schemas.openxmlformats.org/drawingml/2006/picture">
-            <wp:extent cx="5669280" cy="2319251"/>
-            <wp:docPr id="2" name="Picture 2"/>
+            <wp:extent cx="5669280" cy="3607724"/>
+            <wp:docPr id="4" name="Picture 4"/>
             <wp:cNvGraphicFramePr>
               <a:graphicFrameLocks noChangeAspect="1"/>
             </wp:cNvGraphicFramePr>
@@ -2998,11 +4241,11 @@
               <a:graphicData uri="http://schemas.openxmlformats.org/drawingml/2006/picture">
                 <pic:pic>
                   <pic:nvPicPr>
-                    <pic:cNvPr id="0" name="cpu_report_plot.png"/>
+                    <pic:cNvPr id="0" name="cpu_benchmark_plot.png"/>
                     <pic:cNvPicPr/>
                   </pic:nvPicPr>
                   <pic:blipFill>
-                    <a:blip r:embed="rId10"/>
+                    <a:blip r:embed="rId12"/>
                     <a:stretch>
                       <a:fillRect/>
                     </a:stretch>
@@ -3010,7 +4253,7 @@
                   <pic:spPr>
                     <a:xfrm>
                       <a:off x="0" y="0"/>
-                      <a:ext cx="5669280" cy="2319251"/>
+                      <a:ext cx="5669280" cy="3607724"/>
                     </a:xfrm>
                     <a:prstGeom prst="rect"/>
                   </pic:spPr>

</xml_diff>